<commit_message>
fix: corregir bloqueo por red corporativa al iniciar el backend
- Forzar HF_HUB_OFFLINE=1 y TRANSFORMERS_OFFLINE=1 en main.py para
  evitar que sentence-transformers intente conectarse a HuggingFace
  (la red corporativa bloquea huggingface.co, causando reintentos de
  DNS que colgaban el event loop antes de la primera respuesta del chat)
- Agregar *.db a .gitignore
- Actualizar docx de presentacion con el estado real del MVP

Co-Authored-By: Claude Sonnet 4.6 <noreply@anthropic.com>
</commit_message>
<xml_diff>
--- a/Onboarding Assistant — Presentación.docx
+++ b/Onboarding Assistant — Presentación.docx
@@ -105,7 +105,7 @@
           <w:color w:val="111827"/>
           <w:sz w:val="20"/>
         </w:rPr>
-        <w:t>Agosto 2026</w:t>
+        <w:t>Septiembre 2026</w:t>
       </w:r>
     </w:p>
     <w:p>
@@ -237,7 +237,7 @@
           <w:color w:val="4B5563"/>
           <w:sz w:val="21"/>
         </w:rPr>
-        <w:t>El proyecto se encuentra en estado de MVP funcional, listo para demo interna. La primera versión está orientada a la torre de Data y puede escalarse a otras áreas.</w:t>
+        <w:t>El proyecto se encuentra en estado de MVP funcional avanzado, listo para demo interna. La mayoria de las funcionalidades core estan implementadas. La primera versión está orientada a la torre de Data y puede escalarse a otras áreas.</w:t>
       </w:r>
     </w:p>
     <w:p>
@@ -1261,7 +1261,7 @@
                 <w:color w:val="4B5563"/>
                 <w:sz w:val="20"/>
               </w:rPr>
-              <w:t>Claude API (Anthropic) / LM Studio</w:t>
+              <w:t>Mock / Claude API / LM Studio</w:t>
             </w:r>
           </w:p>
         </w:tc>
@@ -1279,7 +1279,7 @@
                 <w:color w:val="4B5563"/>
                 <w:sz w:val="20"/>
               </w:rPr>
-              <w:t>Mejor modelo para síntesis de documentación interna</w:t>
+              <w:t>Funciona sin API key para demo; preparado para produccion</w:t>
             </w:r>
           </w:p>
         </w:tc>
@@ -1757,7 +1757,7 @@
                 <w:color w:val="4B5563"/>
                 <w:sz w:val="20"/>
               </w:rPr>
-              <w:t>Persistencia local, categorías, fechas límite</w:t>
+              <w:t>Persistencia en SQLite via API, categorias, fechas</w:t>
             </w:r>
           </w:p>
         </w:tc>
@@ -1889,7 +1889,7 @@
                 <w:color w:val="4B5563"/>
                 <w:sz w:val="20"/>
               </w:rPr>
-              <w:t>Asistente con respuestas mock</w:t>
+              <w:t>Asistente con streaming en tiempo real</w:t>
             </w:r>
           </w:p>
         </w:tc>
@@ -1925,7 +1925,7 @@
                 <w:color w:val="4B5563"/>
                 <w:sz w:val="20"/>
               </w:rPr>
-              <w:t>Funciona sin dependencias externas</w:t>
+              <w:t>SSE, Markdown, indicadores de fuente, historial</w:t>
             </w:r>
           </w:p>
         </w:tc>
@@ -1981,7 +1981,7 @@
                 <w:color w:val="4B5563"/>
                 <w:sz w:val="20"/>
               </w:rPr>
-              <w:t>Listo para conectar con modelo de IA real</w:t>
+              <w:t>7 docs, 31 chunks, busqueda semantica umbral 0.75</w:t>
             </w:r>
           </w:p>
         </w:tc>
@@ -2156,6 +2156,67 @@
                 <w:sz w:val="20"/>
               </w:rPr>
               <w:t>Color corporativo #A100FF</w:t>
+            </w:r>
+          </w:p>
+        </w:tc>
+      </w:tr>
+      <w:tr>
+        <w:tc>
+          <w:tcPr>
+            <w:tcW w:w="3118" w:type="dxa"/>
+          </w:tcPr>
+          <w:p>
+            <w:pPr>
+              <w:spacing w:before="40" w:after="40"/>
+            </w:pPr>
+            <w:proofErr w:type="spellStart"/>
+            <w:r>
+              <w:rPr>
+                <w:color w:val="4B5563"/>
+                <w:sz w:val="20"/>
+              </w:rPr>
+              <w:t>Panel de administracion de docs</w:t>
+            </w:r>
+            <w:proofErr w:type="spellEnd"/>
+            <w:r>
+              <w:rPr>
+                <w:color w:val="4B5563"/>
+                <w:sz w:val="20"/>
+              </w:rPr>
+            </w:r>
+          </w:p>
+        </w:tc>
+        <w:tc>
+          <w:tcPr>
+            <w:tcW w:w="1701" w:type="dxa"/>
+          </w:tcPr>
+          <w:p>
+            <w:pPr>
+              <w:spacing w:before="40" w:after="40"/>
+            </w:pPr>
+            <w:r>
+              <w:rPr>
+                <w:color w:val="4B5563"/>
+                <w:sz w:val="20"/>
+              </w:rPr>
+              <w:t>✅ Completo</w:t>
+            </w:r>
+          </w:p>
+        </w:tc>
+        <w:tc>
+          <w:tcPr>
+            <w:tcW w:w="4252" w:type="dxa"/>
+          </w:tcPr>
+          <w:p>
+            <w:pPr>
+              <w:spacing w:before="40" w:after="40"/>
+            </w:pPr>
+            <w:r>
+              <w:rPr>
+                <w:color w:val="4B5563"/>
+                <w:sz w:val="20"/>
+              </w:rPr>
+              <w:t>Upload, delete y re-index de documentos desde la UI</w:t>
             </w:r>
           </w:p>
         </w:tc>
@@ -2342,62 +2403,6 @@
           <w:tcPr>
             <w:tcW w:w="1984" w:type="dxa"/>
             <w:shd w:val="clear" w:color="auto" w:fill="F5E6FF"/>
-          </w:tcPr>
-          <w:p>
-            <w:pPr>
-              <w:spacing w:before="40" w:after="40"/>
-            </w:pPr>
-            <w:r>
-              <w:rPr>
-                <w:color w:val="4B5563"/>
-                <w:sz w:val="20"/>
-              </w:rPr>
-              <w:t>Alta</w:t>
-            </w:r>
-          </w:p>
-        </w:tc>
-      </w:tr>
-      <w:tr>
-        <w:tc>
-          <w:tcPr>
-            <w:tcW w:w="2551" w:type="dxa"/>
-            <w:shd w:val="clear" w:color="auto" w:fill="FAFAFA"/>
-          </w:tcPr>
-          <w:p>
-            <w:pPr>
-              <w:spacing w:before="40" w:after="40"/>
-            </w:pPr>
-            <w:r>
-              <w:rPr>
-                <w:color w:val="4B5563"/>
-                <w:sz w:val="20"/>
-              </w:rPr>
-              <w:t>Persistencia en base de datos</w:t>
-            </w:r>
-          </w:p>
-        </w:tc>
-        <w:tc>
-          <w:tcPr>
-            <w:tcW w:w="4535" w:type="dxa"/>
-            <w:shd w:val="clear" w:color="auto" w:fill="FAFAFA"/>
-          </w:tcPr>
-          <w:p>
-            <w:pPr>
-              <w:spacing w:before="40" w:after="40"/>
-            </w:pPr>
-            <w:r>
-              <w:rPr>
-                <w:color w:val="4B5563"/>
-                <w:sz w:val="20"/>
-              </w:rPr>
-              <w:t>Progreso del empleado guardado por usuario</w:t>
-            </w:r>
-          </w:p>
-        </w:tc>
-        <w:tc>
-          <w:tcPr>
-            <w:tcW w:w="1984" w:type="dxa"/>
-            <w:shd w:val="clear" w:color="auto" w:fill="FAFAFA"/>
           </w:tcPr>
           <w:p>
             <w:pPr>
@@ -2633,7 +2638,7 @@
           <w:color w:val="4B5563"/>
           <w:sz w:val="21"/>
         </w:rPr>
-        <w:t>Asistente — usar el chat widget (botón flotante abajo a la derecha) con preguntas como: "¿Qué debo hacer en mi primera semana?", "¿Cómo solicito acceso a una herramienta?", "¿Cuáles son los cursos obligatorios?"</w:t>
+        <w:t>Asistente — usar el chat widget (botón flotante abajo a la derecha) con preguntas como: "¿Qué debo hacer en mi primera semana?", "¿Cómo solicito acceso a una herramienta?", "¿Cuáles son los cursos obligatorios?" — destacar el streaming en tiempo real, los indicadores de fuente y el renderizado Markdown</w:t>
       </w:r>
     </w:p>
     <w:p>

</xml_diff>